<commit_message>
Add generic editorial-process bio for E-E-A-T (per user: no named author, no disclosure)
- Add 'About the DiseaseFix Health Desk' box describing the editorial
  and primary-source review process, without naming an individual
- Leave the commercial link without a sponsored disclosure, per request

Co-Authored-By: Claude Opus 4.8 <noreply@anthropic.com>
Claude-Session: https://claude.ai/code/session_01XMD6RGxXXmTLgo3VdhawDi
</commit_message>
<xml_diff>
--- a/HIPAA-Penetration-Testing-DiseaseFix.docx
+++ b/HIPAA-Penetration-Testing-DiseaseFix.docx
@@ -118,7 +118,7 @@
       <w:r>
         <w:t xml:space="preserve">For criminals, healthcare is a rich and reliable target. The </w:t>
       </w:r>
-      <w:hyperlink w:history="1" r:id="rId3xrisunmhsgvncnpw7r42">
+      <w:hyperlink w:history="1" r:id="rIdaxyz141wphbhkvo411rhw">
         <w:r>
           <w:rPr>
             <w:rStyle w:val="Hyperlink"/>
@@ -139,7 +139,7 @@
       <w:r>
         <w:t xml:space="preserve">Two cautions keep those numbers honest. They are global averages, and in the United States, where this story unfolds, breach costs run far higher and rose again this year. The healthcare figure also rests on a small slice of the organizations studied. Still, the direction is unmistakable, and the stakes stay abstract only until you remember what sits inside the records. The same information readers come to DiseaseFix to understand, whether they are researching a heart condition like </w:t>
       </w:r>
-      <w:hyperlink w:history="1" r:id="rIdk7bmxhuvboiqgbhdef3pm">
+      <w:hyperlink w:history="1" r:id="rId1rzajto-xgffijco8hbaq">
         <w:r>
           <w:rPr>
             <w:rStyle w:val="Hyperlink"/>
@@ -152,7 +152,7 @@
       <w:r>
         <w:t xml:space="preserve">, </w:t>
       </w:r>
-      <w:hyperlink w:history="1" r:id="rId-jplrdc7og0c0s8oz-ktd">
+      <w:hyperlink w:history="1" r:id="rIdp1ffgipeai-82mqgeu5yd">
         <w:r>
           <w:rPr>
             <w:rStyle w:val="Hyperlink"/>
@@ -165,7 +165,7 @@
       <w:r>
         <w:t xml:space="preserve">, or </w:t>
       </w:r>
-      <w:hyperlink w:history="1" r:id="rIdwoft4eh0wb0jp-saoavkp">
+      <w:hyperlink w:history="1" r:id="rIdxs5s6bjpvhtivppwnpkwb">
         <w:r>
           <w:rPr>
             <w:rStyle w:val="Hyperlink"/>
@@ -360,7 +360,7 @@
       <w:r>
         <w:t xml:space="preserve">The law at the center of all this is the Health Insurance Portability and Accountability Act, passed in 1996 and known to nearly everyone as HIPAA. Its Security Rule requires any organization handling electronic protected health information, shortened to ePHI, to protect that data’s confidentiality, integrity, and availability. Tucked into the regulation, at </w:t>
       </w:r>
-      <w:hyperlink w:history="1" r:id="rIdhlh5rici56p-7ug5rqtxk">
+      <w:hyperlink w:history="1" r:id="rIdkild3-byx1jdttv_-wi9h">
         <w:r>
           <w:rPr>
             <w:rStyle w:val="Hyperlink"/>
@@ -405,7 +405,7 @@
       <w:r>
         <w:t xml:space="preserve">A penetration test is a controlled, authorized rehearsal of a real attack. That is the premise behind </w:t>
       </w:r>
-      <w:hyperlink w:history="1" r:id="rIdv40aohqex2lolsrol_7s_">
+      <w:hyperlink w:history="1" r:id="rId-muwne_pxmb33jglatexs">
         <w:r>
           <w:rPr>
             <w:rStyle w:val="Hyperlink"/>
@@ -418,7 +418,7 @@
       <w:r>
         <w:t xml:space="preserve">, work that narrows the search to the systems that create, store, or move patient data and ties every finding back to the Security Rule so it feeds the risk analysis the law requires. Web applications are measured against the </w:t>
       </w:r>
-      <w:hyperlink w:history="1" r:id="rIdagbk7rltbxhk1bkxczjkm">
+      <w:hyperlink w:history="1" r:id="rId1urxkp6nsy66ajor3ly5j">
         <w:r>
           <w:rPr>
             <w:rStyle w:val="Hyperlink"/>
@@ -479,7 +479,7 @@
       <w:r>
         <w:t xml:space="preserve">The office’s </w:t>
       </w:r>
-      <w:hyperlink w:history="1" r:id="rIdqej4tw2_5e01hqw9cz-ew">
+      <w:hyperlink w:history="1" r:id="rIdyvdcnbknrj7egl7jcpcac">
         <w:r>
           <w:rPr>
             <w:rStyle w:val="Hyperlink"/>
@@ -524,7 +524,7 @@
       <w:r>
         <w:t xml:space="preserve">The stakes behind that silence are not abstract. A breach can spill mental health histories, HIV status, and genetic results, the kind of detail that cannot be taken back once it is loose. Readers can browse the full </w:t>
       </w:r>
-      <w:hyperlink w:history="1" r:id="rIdwye5ypagxxvb7a9i6v1bc">
+      <w:hyperlink w:history="1" r:id="rIdyx_c_zy8fua7ky3ovzr9m">
         <w:r>
           <w:rPr>
             <w:rStyle w:val="Hyperlink"/>
@@ -808,7 +808,7 @@
               </w:rPr>
               <w:t xml:space="preserve">Breach costs and response times: </w:t>
             </w:r>
-            <w:hyperlink w:history="1" r:id="rIdpgfw5ygickxg1his7jgft">
+            <w:hyperlink w:history="1" r:id="rIdqfhygm1fe9vjz2cgzxw0g">
               <w:r>
                 <w:rPr>
                   <w:rStyle w:val="Hyperlink"/>
@@ -846,7 +846,7 @@
               </w:rPr>
               <w:t xml:space="preserve">Risk analysis requirement: </w:t>
             </w:r>
-            <w:hyperlink w:history="1" r:id="rIdvt5wl-dpg0o1z5v9lgz4q">
+            <w:hyperlink w:history="1" r:id="rIds3ezqus1qzaydf1lf4_y5">
               <w:r>
                 <w:rPr>
                   <w:rStyle w:val="Hyperlink"/>
@@ -884,7 +884,7 @@
               </w:rPr>
               <w:t xml:space="preserve">Regulator guidance: </w:t>
             </w:r>
-            <w:hyperlink w:history="1" r:id="rIdmt6ufrpchlk7wqpkasosc">
+            <w:hyperlink w:history="1" r:id="rIdz09lvt4f_ag_cx4tgt3yv">
               <w:r>
                 <w:rPr>
                   <w:rStyle w:val="Hyperlink"/>
@@ -922,7 +922,7 @@
               </w:rPr>
               <w:t xml:space="preserve">Enforcement actions: </w:t>
             </w:r>
-            <w:hyperlink w:history="1" r:id="rIdgy4yiyoxuuodup0bemauu">
+            <w:hyperlink w:history="1" r:id="rIdwfgfo9tf2nove2wtu4klt">
               <w:r>
                 <w:rPr>
                   <w:rStyle w:val="Hyperlink"/>
@@ -960,7 +960,7 @@
               </w:rPr>
               <w:t xml:space="preserve">Web testing framework: </w:t>
             </w:r>
-            <w:hyperlink w:history="1" r:id="rIdoey5xq3hcjobatrl_7zce">
+            <w:hyperlink w:history="1" r:id="rIdaubgujblpzz5-l5a2epoo">
               <w:r>
                 <w:rPr>
                   <w:rStyle w:val="Hyperlink"/>
@@ -984,40 +984,89 @@
     </w:tbl>
     <w:p>
       <w:pPr>
+        <w:spacing w:after="40"/>
+      </w:pPr>
+      <w:r>
+        <w:t xml:space="preserve"/>
+      </w:r>
+    </w:p>
+    <w:tbl>
+      <w:tblPr>
+        <w:tblW w:type="dxa" w:w="9100"/>
+        <w:tblBorders>
+          <w:top w:val="none"/>
+          <w:left w:val="none"/>
+          <w:bottom w:val="none"/>
+          <w:right w:val="none"/>
+          <w:insideH w:val="none"/>
+          <w:insideV w:val="none"/>
+        </w:tblBorders>
+      </w:tblPr>
+      <w:tblGrid>
+        <w:gridCol w:w="9100"/>
+      </w:tblGrid>
+      <w:tr>
+        <w:tc>
+          <w:tcPr>
+            <w:tcW w:type="dxa" w:w="9100"/>
+            <w:tcBorders>
+              <w:top w:val="single" w:color="F8FAFC" w:sz="2"/>
+              <w:left w:val="single" w:color="0F766E" w:sz="26"/>
+              <w:bottom w:val="single" w:color="F8FAFC" w:sz="2"/>
+              <w:right w:val="single" w:color="F8FAFC" w:sz="2"/>
+            </w:tcBorders>
+            <w:shd w:fill="F8FAFC" w:color="auto" w:val="clear"/>
+            <w:tcMar>
+              <w:top w:type="dxa" w:w="140"/>
+              <w:left w:type="dxa" w:w="190"/>
+              <w:bottom w:type="dxa" w:w="140"/>
+              <w:right w:type="dxa" w:w="190"/>
+            </w:tcMar>
+          </w:tcPr>
+          <w:p>
+            <w:pPr>
+              <w:spacing w:after="90"/>
+            </w:pPr>
+            <w:r>
+              <w:rPr>
+                <w:b/>
+                <w:bCs/>
+                <w:color w:val="0F766E"/>
+                <w:sz w:val="19"/>
+                <w:szCs w:val="19"/>
+              </w:rPr>
+              <w:t xml:space="preserve">ABOUT THE DISEASEFIX HEALTH DESK</w:t>
+            </w:r>
+          </w:p>
+          <w:p>
+            <w:pPr>
+              <w:spacing w:after="0" w:line="282"/>
+            </w:pPr>
+            <w:r>
+              <w:rPr>
+                <w:color w:val="1F2937"/>
+                <w:sz w:val="19"/>
+                <w:szCs w:val="19"/>
+              </w:rPr>
+              <w:t xml:space="preserve">This article was researched and written by the DiseaseFix Health Desk, the publication’s in house editorial team covering health, medicine, and the systems that protect patient data. Every piece is checked against primary and authoritative sources, government regulations, official guidance, and named industry reports, before it is published, and figures are updated as newer data is released. DiseaseFix publishes patient focused health information for readers worldwide.</w:t>
+            </w:r>
+          </w:p>
+        </w:tc>
+      </w:tr>
+    </w:tbl>
+    <w:p>
+      <w:pPr>
+        <w:spacing w:after="40"/>
+      </w:pPr>
+      <w:r>
+        <w:t xml:space="preserve"/>
+      </w:r>
+    </w:p>
+    <w:p>
+      <w:pPr>
         <w:spacing w:after="60"/>
       </w:pPr>
-      <w:r>
-        <w:t xml:space="preserve"/>
-      </w:r>
-    </w:p>
-    <w:p>
-      <w:pPr>
-        <w:spacing w:after="50"/>
-      </w:pPr>
-      <w:r>
-        <w:rPr>
-          <w:b/>
-          <w:bCs/>
-          <w:color w:val="1F2937"/>
-          <w:sz w:val="18"/>
-          <w:szCs w:val="18"/>
-        </w:rPr>
-        <w:t xml:space="preserve">About DiseaseFix:  </w:t>
-      </w:r>
-      <w:r>
-        <w:rPr>
-          <w:color w:val="6B7280"/>
-          <w:sz w:val="18"/>
-          <w:szCs w:val="18"/>
-        </w:rPr>
-        <w:t xml:space="preserve">DiseaseFix publishes patient focused health and medical information for readers worldwide.</w:t>
-      </w:r>
-    </w:p>
-    <w:p>
-      <w:pPr>
-        <w:spacing w:after="60"/>
-      </w:pPr>
-      <w:hyperlink w:history="1" r:id="rIdaw9rkkyunu8uhbqppiwr2">
+      <w:hyperlink w:history="1" r:id="rIdnh8kqys33kmpat3oxvqhl">
         <w:r>
           <w:rPr>
             <w:rStyle w:val="Hyperlink"/>
@@ -1034,7 +1083,7 @@
         </w:rPr>
         <w:t xml:space="preserve">     </w:t>
       </w:r>
-      <w:hyperlink w:history="1" r:id="rIdha3skkn_0g5jdex737msa">
+      <w:hyperlink w:history="1" r:id="rIdokh1p9pkxlpyuczeuslvf">
         <w:r>
           <w:rPr>
             <w:rStyle w:val="Hyperlink"/>
@@ -1051,7 +1100,7 @@
         </w:rPr>
         <w:t xml:space="preserve">     </w:t>
       </w:r>
-      <w:hyperlink w:history="1" r:id="rIdgyetijky-t5iodklybzse">
+      <w:hyperlink w:history="1" r:id="rIdaxsa76ccodvcp4ei7tzld">
         <w:r>
           <w:rPr>
             <w:rStyle w:val="Hyperlink"/>

</xml_diff>